<commit_message>
agrego documento word y pdf
</commit_message>
<xml_diff>
--- a/entregable_n2/Entregable2_TorresEmiliana.docx
+++ b/entregable_n2/Entregable2_TorresEmiliana.docx
@@ -159,13 +159,23 @@
                                           <w:szCs w:val="28"/>
                                         </w:rPr>
                                       </w:pPr>
+                                      <w:proofErr w:type="spellStart"/>
                                       <w:r>
                                         <w:rPr>
                                           <w:color w:val="FFFFFF" w:themeColor="background1"/>
                                           <w:sz w:val="28"/>
                                           <w:szCs w:val="28"/>
                                         </w:rPr>
-                                        <w:t>Entregable n2</w:t>
+                                        <w:t>Entregable</w:t>
+                                      </w:r>
+                                      <w:proofErr w:type="spellEnd"/>
+                                      <w:r>
+                                        <w:rPr>
+                                          <w:color w:val="FFFFFF" w:themeColor="background1"/>
+                                          <w:sz w:val="28"/>
+                                          <w:szCs w:val="28"/>
+                                        </w:rPr>
+                                        <w:t xml:space="preserve"> n2</w:t>
                                       </w:r>
                                     </w:p>
                                   </w:sdtContent>
@@ -3471,13 +3481,23 @@
                                     <w:szCs w:val="28"/>
                                   </w:rPr>
                                 </w:pPr>
+                                <w:proofErr w:type="spellStart"/>
                                 <w:r>
                                   <w:rPr>
                                     <w:color w:val="FFFFFF" w:themeColor="background1"/>
                                     <w:sz w:val="28"/>
                                     <w:szCs w:val="28"/>
                                   </w:rPr>
-                                  <w:t>Entregable n2</w:t>
+                                  <w:t>Entregable</w:t>
+                                </w:r>
+                                <w:proofErr w:type="spellEnd"/>
+                                <w:r>
+                                  <w:rPr>
+                                    <w:color w:val="FFFFFF" w:themeColor="background1"/>
+                                    <w:sz w:val="28"/>
+                                    <w:szCs w:val="28"/>
+                                  </w:rPr>
+                                  <w:t xml:space="preserve"> n2</w:t>
                                 </w:r>
                               </w:p>
                             </w:sdtContent>
@@ -3980,14 +4000,34 @@
                                     <w:text/>
                                   </w:sdtPr>
                                   <w:sdtContent>
+                                    <w:proofErr w:type="spellStart"/>
                                     <w:r>
                                       <w:rPr>
                                         <w:color w:val="404040" w:themeColor="text1" w:themeTint="BF"/>
                                         <w:sz w:val="36"/>
                                         <w:szCs w:val="36"/>
                                       </w:rPr>
-                                      <w:t>Curso SQL - Coderhouse</w:t>
+                                      <w:t>Curso</w:t>
                                     </w:r>
+                                    <w:proofErr w:type="spellEnd"/>
+                                    <w:r>
+                                      <w:rPr>
+                                        <w:color w:val="404040" w:themeColor="text1" w:themeTint="BF"/>
+                                        <w:sz w:val="36"/>
+                                        <w:szCs w:val="36"/>
+                                      </w:rPr>
+                                      <w:t xml:space="preserve"> SQL - </w:t>
+                                    </w:r>
+                                    <w:proofErr w:type="spellStart"/>
+                                    <w:r>
+                                      <w:rPr>
+                                        <w:color w:val="404040" w:themeColor="text1" w:themeTint="BF"/>
+                                        <w:sz w:val="36"/>
+                                        <w:szCs w:val="36"/>
+                                      </w:rPr>
+                                      <w:t>Coderhouse</w:t>
+                                    </w:r>
+                                    <w:proofErr w:type="spellEnd"/>
                                   </w:sdtContent>
                                 </w:sdt>
                               </w:p>
@@ -4077,14 +4117,34 @@
                               <w:text/>
                             </w:sdtPr>
                             <w:sdtContent>
+                              <w:proofErr w:type="spellStart"/>
                               <w:r>
                                 <w:rPr>
                                   <w:color w:val="404040" w:themeColor="text1" w:themeTint="BF"/>
                                   <w:sz w:val="36"/>
                                   <w:szCs w:val="36"/>
                                 </w:rPr>
-                                <w:t>Curso SQL - Coderhouse</w:t>
+                                <w:t>Curso</w:t>
                               </w:r>
+                              <w:proofErr w:type="spellEnd"/>
+                              <w:r>
+                                <w:rPr>
+                                  <w:color w:val="404040" w:themeColor="text1" w:themeTint="BF"/>
+                                  <w:sz w:val="36"/>
+                                  <w:szCs w:val="36"/>
+                                </w:rPr>
+                                <w:t xml:space="preserve"> SQL - </w:t>
+                              </w:r>
+                              <w:proofErr w:type="spellStart"/>
+                              <w:r>
+                                <w:rPr>
+                                  <w:color w:val="404040" w:themeColor="text1" w:themeTint="BF"/>
+                                  <w:sz w:val="36"/>
+                                  <w:szCs w:val="36"/>
+                                </w:rPr>
+                                <w:t>Coderhouse</w:t>
+                              </w:r>
+                              <w:proofErr w:type="spellEnd"/>
                             </w:sdtContent>
                           </w:sdt>
                         </w:p>
@@ -4230,7 +4290,27 @@
           <w:lang w:val="es-AR"/>
         </w:rPr>
         <w:br/>
-        <w:t>En ella se gestionan clases de Crossfit, entrenamiento Funcional y Weightlifting. Además, se incluye un análisis descriptivo con una tabla que muestra el contenido detallado de la base de datos, junto con un diagrama esquemático que representa las relaciones entre sus entidades.</w:t>
+        <w:t xml:space="preserve">En ella se gestionan clases de Crossfit, entrenamiento Funcional y </w:t>
+      </w:r>
+      <w:proofErr w:type="spellStart"/>
+      <w:r>
+        <w:rPr>
+          <w:rFonts w:ascii="Arial" w:eastAsia="Arial" w:hAnsi="Arial" w:cs="Arial"/>
+          <w:sz w:val="24"/>
+          <w:szCs w:val="24"/>
+          <w:lang w:val="es-AR"/>
+        </w:rPr>
+        <w:t>Weightlifting</w:t>
+      </w:r>
+      <w:proofErr w:type="spellEnd"/>
+      <w:r>
+        <w:rPr>
+          <w:rFonts w:ascii="Arial" w:eastAsia="Arial" w:hAnsi="Arial" w:cs="Arial"/>
+          <w:sz w:val="24"/>
+          <w:szCs w:val="24"/>
+          <w:lang w:val="es-AR"/>
+        </w:rPr>
+        <w:t>. Además, se incluye un análisis descriptivo con una tabla que muestra el contenido detallado de la base de datos, junto con un diagrama esquemático que representa las relaciones entre sus entidades.</w:t>
       </w:r>
     </w:p>
     <w:p>
@@ -4306,7 +4386,27 @@
           <w:szCs w:val="24"/>
           <w:lang w:val="es-AR"/>
         </w:rPr>
-        <w:t>En un gimnasio o box especializado en CrossFit, Funcional y Weightlifting, la gestión de forma manual de las inscripciones, reservas de clases, asignación de entrenadores y el control de pagos genera demoras, errores y falta de seguimiento. Por lo tanto, esta situación dificulta tanto el trabajo del personal como la experiencia del cliente.</w:t>
+        <w:t xml:space="preserve">En un gimnasio o box especializado en CrossFit, Funcional y </w:t>
+      </w:r>
+      <w:proofErr w:type="spellStart"/>
+      <w:r>
+        <w:rPr>
+          <w:rFonts w:ascii="Arial" w:eastAsia="Arial" w:hAnsi="Arial" w:cs="Arial"/>
+          <w:sz w:val="24"/>
+          <w:szCs w:val="24"/>
+          <w:lang w:val="es-AR"/>
+        </w:rPr>
+        <w:t>Weightlifting</w:t>
+      </w:r>
+      <w:proofErr w:type="spellEnd"/>
+      <w:r>
+        <w:rPr>
+          <w:rFonts w:ascii="Arial" w:eastAsia="Arial" w:hAnsi="Arial" w:cs="Arial"/>
+          <w:sz w:val="24"/>
+          <w:szCs w:val="24"/>
+          <w:lang w:val="es-AR"/>
+        </w:rPr>
+        <w:t>, la gestión de forma manual de las inscripciones, reservas de clases, asignación de entrenadores y el control de pagos genera demoras, errores y falta de seguimiento. Por lo tanto, esta situación dificulta tanto el trabajo del personal como la experiencia del cliente.</w:t>
       </w:r>
     </w:p>
     <w:p>
@@ -4743,6 +4843,7 @@
           <w:u w:val="single"/>
         </w:rPr>
       </w:pPr>
+      <w:proofErr w:type="spellStart"/>
       <w:r>
         <w:rPr>
           <w:rFonts w:ascii="Arial" w:eastAsia="Arial" w:hAnsi="Arial" w:cs="Arial"/>
@@ -4753,7 +4854,67 @@
           <w:u w:val="single"/>
         </w:rPr>
         <w:lastRenderedPageBreak/>
-        <w:t>Diagrama Entidad Relación (DER)</w:t>
+        <w:t>Diagrama</w:t>
+      </w:r>
+      <w:proofErr w:type="spellEnd"/>
+      <w:r>
+        <w:rPr>
+          <w:rFonts w:ascii="Arial" w:eastAsia="Arial" w:hAnsi="Arial" w:cs="Arial"/>
+          <w:b/>
+          <w:bCs/>
+          <w:sz w:val="24"/>
+          <w:szCs w:val="24"/>
+          <w:u w:val="single"/>
+        </w:rPr>
+        <w:t xml:space="preserve"> </w:t>
+      </w:r>
+      <w:proofErr w:type="spellStart"/>
+      <w:r>
+        <w:rPr>
+          <w:rFonts w:ascii="Arial" w:eastAsia="Arial" w:hAnsi="Arial" w:cs="Arial"/>
+          <w:b/>
+          <w:bCs/>
+          <w:sz w:val="24"/>
+          <w:szCs w:val="24"/>
+          <w:u w:val="single"/>
+        </w:rPr>
+        <w:t>Entidad</w:t>
+      </w:r>
+      <w:proofErr w:type="spellEnd"/>
+      <w:r>
+        <w:rPr>
+          <w:rFonts w:ascii="Arial" w:eastAsia="Arial" w:hAnsi="Arial" w:cs="Arial"/>
+          <w:b/>
+          <w:bCs/>
+          <w:sz w:val="24"/>
+          <w:szCs w:val="24"/>
+          <w:u w:val="single"/>
+        </w:rPr>
+        <w:t xml:space="preserve"> </w:t>
+      </w:r>
+      <w:proofErr w:type="spellStart"/>
+      <w:r>
+        <w:rPr>
+          <w:rFonts w:ascii="Arial" w:eastAsia="Arial" w:hAnsi="Arial" w:cs="Arial"/>
+          <w:b/>
+          <w:bCs/>
+          <w:sz w:val="24"/>
+          <w:szCs w:val="24"/>
+          <w:u w:val="single"/>
+        </w:rPr>
+        <w:t>Relación</w:t>
+      </w:r>
+      <w:proofErr w:type="spellEnd"/>
+      <w:r>
+        <w:rPr>
+          <w:rFonts w:ascii="Arial" w:eastAsia="Arial" w:hAnsi="Arial" w:cs="Arial"/>
+          <w:b/>
+          <w:bCs/>
+          <w:sz w:val="24"/>
+          <w:szCs w:val="24"/>
+          <w:u w:val="single"/>
+        </w:rPr>
+        <w:t xml:space="preserve"> (DER)</w:t>
       </w:r>
     </w:p>
     <w:p>
@@ -4825,6 +4986,7 @@
     <w:p>
       <w:pPr>
         <w:rPr>
+          <w:rFonts w:ascii="Arial" w:hAnsi="Arial" w:cs="Arial"/>
           <w:b/>
           <w:bCs/>
           <w:lang w:val="es-MX"/>
@@ -4832,6 +4994,7 @@
       </w:pPr>
       <w:r>
         <w:rPr>
+          <w:rFonts w:ascii="Arial" w:hAnsi="Arial" w:cs="Arial"/>
           <w:b/>
           <w:bCs/>
           <w:sz w:val="24"/>
@@ -4848,56 +5011,88 @@
           <w:ilvl w:val="0"/>
           <w:numId w:val="1"/>
         </w:numPr>
-        <w:rPr>
+        <w:jc w:val="both"/>
+        <w:rPr>
+          <w:rFonts w:ascii="Arial" w:hAnsi="Arial" w:cs="Arial"/>
           <w:b/>
           <w:bCs/>
           <w:lang w:val="es-MX"/>
         </w:rPr>
       </w:pPr>
-      <w:r>
-        <w:rPr>
+      <w:proofErr w:type="spellStart"/>
+      <w:r>
+        <w:rPr>
+          <w:rFonts w:ascii="Arial" w:hAnsi="Arial" w:cs="Arial"/>
           <w:b/>
           <w:bCs/>
           <w:lang w:val="es-MX"/>
         </w:rPr>
         <w:t>Vista_clientes_activos</w:t>
       </w:r>
+      <w:proofErr w:type="spellEnd"/>
     </w:p>
     <w:p>
       <w:pPr>
-        <w:rPr>
-          <w:lang w:val="es-MX"/>
-        </w:rPr>
-      </w:pPr>
-      <w:r>
-        <w:rPr>
-          <w:lang w:val="es-MX"/>
-        </w:rPr>
-        <w:t>El objetivo de esta vista es ver rápidamente los clientes que están habilitados. Nos muestra: Id_cliente, n</w:t>
-      </w:r>
-      <w:r>
-        <w:rPr>
-          <w:lang w:val="es-MX"/>
-        </w:rPr>
-        <w:t>ombre, apellido</w:t>
-      </w:r>
-      <w:r>
-        <w:rPr>
-          <w:lang w:val="es-MX"/>
-        </w:rPr>
-        <w:t>, d</w:t>
-      </w:r>
-      <w:r>
-        <w:rPr>
-          <w:lang w:val="es-MX"/>
-        </w:rPr>
-        <w:t>ni</w:t>
-      </w:r>
-      <w:r>
-        <w:rPr>
-          <w:lang w:val="es-MX"/>
-        </w:rPr>
-        <w:t>, fecha_registro.</w:t>
+        <w:jc w:val="both"/>
+        <w:rPr>
+          <w:rFonts w:ascii="Arial" w:hAnsi="Arial" w:cs="Arial"/>
+          <w:lang w:val="es-MX"/>
+        </w:rPr>
+      </w:pPr>
+      <w:r>
+        <w:rPr>
+          <w:rFonts w:ascii="Arial" w:hAnsi="Arial" w:cs="Arial"/>
+          <w:lang w:val="es-MX"/>
+        </w:rPr>
+        <w:t xml:space="preserve">El objetivo de esta vista es ver rápidamente los clientes que están habilitados. Nos muestra: </w:t>
+      </w:r>
+      <w:proofErr w:type="spellStart"/>
+      <w:r>
+        <w:rPr>
+          <w:rFonts w:ascii="Arial" w:hAnsi="Arial" w:cs="Arial"/>
+          <w:lang w:val="es-MX"/>
+        </w:rPr>
+        <w:t>Id_cliente</w:t>
+      </w:r>
+      <w:proofErr w:type="spellEnd"/>
+      <w:r>
+        <w:rPr>
+          <w:rFonts w:ascii="Arial" w:hAnsi="Arial" w:cs="Arial"/>
+          <w:lang w:val="es-MX"/>
+        </w:rPr>
+        <w:t xml:space="preserve">, nombre, apellido, </w:t>
+      </w:r>
+      <w:proofErr w:type="spellStart"/>
+      <w:r>
+        <w:rPr>
+          <w:rFonts w:ascii="Arial" w:hAnsi="Arial" w:cs="Arial"/>
+          <w:lang w:val="es-MX"/>
+        </w:rPr>
+        <w:t>dni</w:t>
+      </w:r>
+      <w:proofErr w:type="spellEnd"/>
+      <w:r>
+        <w:rPr>
+          <w:rFonts w:ascii="Arial" w:hAnsi="Arial" w:cs="Arial"/>
+          <w:lang w:val="es-MX"/>
+        </w:rPr>
+        <w:t xml:space="preserve">, </w:t>
+      </w:r>
+      <w:proofErr w:type="spellStart"/>
+      <w:r>
+        <w:rPr>
+          <w:rFonts w:ascii="Arial" w:hAnsi="Arial" w:cs="Arial"/>
+          <w:lang w:val="es-MX"/>
+        </w:rPr>
+        <w:t>fecha_registro</w:t>
+      </w:r>
+      <w:proofErr w:type="spellEnd"/>
+      <w:r>
+        <w:rPr>
+          <w:rFonts w:ascii="Arial" w:hAnsi="Arial" w:cs="Arial"/>
+          <w:lang w:val="es-MX"/>
+        </w:rPr>
+        <w:t>.</w:t>
       </w:r>
     </w:p>
     <w:p>
@@ -4907,53 +5102,90 @@
           <w:ilvl w:val="0"/>
           <w:numId w:val="1"/>
         </w:numPr>
-        <w:rPr>
+        <w:jc w:val="both"/>
+        <w:rPr>
+          <w:rFonts w:ascii="Arial" w:hAnsi="Arial" w:cs="Arial"/>
           <w:b/>
           <w:bCs/>
           <w:lang w:val="es-MX"/>
         </w:rPr>
       </w:pPr>
-      <w:r>
-        <w:rPr>
+      <w:proofErr w:type="spellStart"/>
+      <w:r>
+        <w:rPr>
+          <w:rFonts w:ascii="Arial" w:hAnsi="Arial" w:cs="Arial"/>
           <w:b/>
           <w:bCs/>
           <w:lang w:val="es-MX"/>
         </w:rPr>
         <w:t>Vista_clases_completas</w:t>
       </w:r>
+      <w:proofErr w:type="spellEnd"/>
     </w:p>
     <w:p>
       <w:pPr>
-        <w:rPr>
-          <w:lang w:val="es-MX"/>
-        </w:rPr>
-      </w:pPr>
-      <w:r>
-        <w:rPr>
-          <w:lang w:val="es-MX"/>
-        </w:rPr>
-        <w:t>El objetivo es mostrar toda la info relevante de una clase</w:t>
-      </w:r>
-      <w:r>
-        <w:rPr>
+        <w:jc w:val="both"/>
+        <w:rPr>
+          <w:rFonts w:ascii="Arial" w:hAnsi="Arial" w:cs="Arial"/>
+          <w:lang w:val="es-MX"/>
+        </w:rPr>
+      </w:pPr>
+      <w:r>
+        <w:rPr>
+          <w:rFonts w:ascii="Arial" w:hAnsi="Arial" w:cs="Arial"/>
+          <w:lang w:val="es-MX"/>
+        </w:rPr>
+        <w:t xml:space="preserve">El objetivo es mostrar toda la </w:t>
+      </w:r>
+      <w:proofErr w:type="spellStart"/>
+      <w:r>
+        <w:rPr>
+          <w:rFonts w:ascii="Arial" w:hAnsi="Arial" w:cs="Arial"/>
+          <w:lang w:val="es-MX"/>
+        </w:rPr>
+        <w:t>info</w:t>
+      </w:r>
+      <w:proofErr w:type="spellEnd"/>
+      <w:r>
+        <w:rPr>
+          <w:rFonts w:ascii="Arial" w:hAnsi="Arial" w:cs="Arial"/>
+          <w:lang w:val="es-MX"/>
+        </w:rPr>
+        <w:t xml:space="preserve"> relevante de una clase</w:t>
+      </w:r>
+      <w:r>
+        <w:rPr>
+          <w:rFonts w:ascii="Arial" w:hAnsi="Arial" w:cs="Arial"/>
           <w:lang w:val="es-MX"/>
         </w:rPr>
         <w:t>, nos puede servir como una agenda diaria</w:t>
       </w:r>
       <w:r>
         <w:rPr>
-          <w:lang w:val="es-MX"/>
-        </w:rPr>
-        <w:t>. Unimos las tablas clases, entrenadores y wods</w:t>
-      </w:r>
-      <w:r>
-        <w:rPr>
+          <w:rFonts w:ascii="Arial" w:hAnsi="Arial" w:cs="Arial"/>
+          <w:lang w:val="es-MX"/>
+        </w:rPr>
+        <w:t xml:space="preserve">. Unimos las tablas clases, entrenadores y </w:t>
+      </w:r>
+      <w:proofErr w:type="spellStart"/>
+      <w:r>
+        <w:rPr>
+          <w:rFonts w:ascii="Arial" w:hAnsi="Arial" w:cs="Arial"/>
+          <w:lang w:val="es-MX"/>
+        </w:rPr>
+        <w:t>wods</w:t>
+      </w:r>
+      <w:proofErr w:type="spellEnd"/>
+      <w:r>
+        <w:rPr>
+          <w:rFonts w:ascii="Arial" w:hAnsi="Arial" w:cs="Arial"/>
           <w:lang w:val="es-MX"/>
         </w:rPr>
         <w:t xml:space="preserve"> con un JOIN</w:t>
       </w:r>
       <w:r>
         <w:rPr>
+          <w:rFonts w:ascii="Arial" w:hAnsi="Arial" w:cs="Arial"/>
           <w:lang w:val="es-MX"/>
         </w:rPr>
         <w:t xml:space="preserve">. </w:t>
@@ -4961,48 +5193,91 @@
     </w:p>
     <w:p>
       <w:pPr>
-        <w:rPr>
-          <w:lang w:val="es-MX"/>
-        </w:rPr>
-      </w:pPr>
-      <w:r>
-        <w:rPr>
+        <w:jc w:val="both"/>
+        <w:rPr>
+          <w:rFonts w:ascii="Arial" w:hAnsi="Arial" w:cs="Arial"/>
+          <w:lang w:val="es-MX"/>
+        </w:rPr>
+      </w:pPr>
+      <w:r>
+        <w:rPr>
+          <w:rFonts w:ascii="Arial" w:hAnsi="Arial" w:cs="Arial"/>
           <w:lang w:val="es-MX"/>
         </w:rPr>
         <w:t>De la tabla clases usamos las columnas</w:t>
       </w:r>
       <w:r>
         <w:rPr>
-          <w:lang w:val="es-MX"/>
-        </w:rPr>
-        <w:t xml:space="preserve"> id_clase,</w:t>
-      </w:r>
-      <w:r>
-        <w:rPr>
+          <w:rFonts w:ascii="Arial" w:hAnsi="Arial" w:cs="Arial"/>
+          <w:lang w:val="es-MX"/>
+        </w:rPr>
+        <w:t xml:space="preserve"> </w:t>
+      </w:r>
+      <w:proofErr w:type="spellStart"/>
+      <w:r>
+        <w:rPr>
+          <w:rFonts w:ascii="Arial" w:hAnsi="Arial" w:cs="Arial"/>
+          <w:lang w:val="es-MX"/>
+        </w:rPr>
+        <w:t>id_clase</w:t>
+      </w:r>
+      <w:proofErr w:type="spellEnd"/>
+      <w:r>
+        <w:rPr>
+          <w:rFonts w:ascii="Arial" w:hAnsi="Arial" w:cs="Arial"/>
+          <w:lang w:val="es-MX"/>
+        </w:rPr>
+        <w:t>,</w:t>
+      </w:r>
+      <w:r>
+        <w:rPr>
+          <w:rFonts w:ascii="Arial" w:hAnsi="Arial" w:cs="Arial"/>
           <w:lang w:val="es-MX"/>
         </w:rPr>
         <w:t xml:space="preserve"> fecha, hora</w:t>
       </w:r>
       <w:r>
         <w:rPr>
+          <w:rFonts w:ascii="Arial" w:hAnsi="Arial" w:cs="Arial"/>
           <w:lang w:val="es-MX"/>
         </w:rPr>
         <w:t>,</w:t>
       </w:r>
       <w:r>
         <w:rPr>
-          <w:lang w:val="es-MX"/>
-        </w:rPr>
-        <w:t xml:space="preserve"> tipo_clase</w:t>
-      </w:r>
-      <w:r>
-        <w:rPr>
-          <w:lang w:val="es-MX"/>
-        </w:rPr>
-        <w:t xml:space="preserve"> y cupo_maximo</w:t>
-      </w:r>
-      <w:r>
-        <w:rPr>
+          <w:rFonts w:ascii="Arial" w:hAnsi="Arial" w:cs="Arial"/>
+          <w:lang w:val="es-MX"/>
+        </w:rPr>
+        <w:t xml:space="preserve"> </w:t>
+      </w:r>
+      <w:proofErr w:type="spellStart"/>
+      <w:r>
+        <w:rPr>
+          <w:rFonts w:ascii="Arial" w:hAnsi="Arial" w:cs="Arial"/>
+          <w:lang w:val="es-MX"/>
+        </w:rPr>
+        <w:t>tipo_clase</w:t>
+      </w:r>
+      <w:proofErr w:type="spellEnd"/>
+      <w:r>
+        <w:rPr>
+          <w:rFonts w:ascii="Arial" w:hAnsi="Arial" w:cs="Arial"/>
+          <w:lang w:val="es-MX"/>
+        </w:rPr>
+        <w:t xml:space="preserve"> y </w:t>
+      </w:r>
+      <w:proofErr w:type="spellStart"/>
+      <w:r>
+        <w:rPr>
+          <w:rFonts w:ascii="Arial" w:hAnsi="Arial" w:cs="Arial"/>
+          <w:lang w:val="es-MX"/>
+        </w:rPr>
+        <w:t>cupo_maximo</w:t>
+      </w:r>
+      <w:proofErr w:type="spellEnd"/>
+      <w:r>
+        <w:rPr>
+          <w:rFonts w:ascii="Arial" w:hAnsi="Arial" w:cs="Arial"/>
           <w:lang w:val="es-MX"/>
         </w:rPr>
         <w:t>.</w:t>
@@ -5010,28 +5285,98 @@
     </w:p>
     <w:p>
       <w:pPr>
-        <w:rPr>
-          <w:lang w:val="es-MX"/>
-        </w:rPr>
-      </w:pPr>
-      <w:r>
-        <w:rPr>
-          <w:lang w:val="es-MX"/>
-        </w:rPr>
-        <w:t>De la tabla entrenadores usamos las columnas nombre como nombre_entrenador y apellido como apellido_entrenador.</w:t>
+        <w:jc w:val="both"/>
+        <w:rPr>
+          <w:rFonts w:ascii="Arial" w:hAnsi="Arial" w:cs="Arial"/>
+          <w:lang w:val="es-MX"/>
+        </w:rPr>
+      </w:pPr>
+      <w:r>
+        <w:rPr>
+          <w:rFonts w:ascii="Arial" w:hAnsi="Arial" w:cs="Arial"/>
+          <w:lang w:val="es-MX"/>
+        </w:rPr>
+        <w:t xml:space="preserve">De la tabla entrenadores usamos las columnas nombre como </w:t>
+      </w:r>
+      <w:proofErr w:type="spellStart"/>
+      <w:r>
+        <w:rPr>
+          <w:rFonts w:ascii="Arial" w:hAnsi="Arial" w:cs="Arial"/>
+          <w:lang w:val="es-MX"/>
+        </w:rPr>
+        <w:t>nombre_entrenador</w:t>
+      </w:r>
+      <w:proofErr w:type="spellEnd"/>
+      <w:r>
+        <w:rPr>
+          <w:rFonts w:ascii="Arial" w:hAnsi="Arial" w:cs="Arial"/>
+          <w:lang w:val="es-MX"/>
+        </w:rPr>
+        <w:t xml:space="preserve"> y apellido como </w:t>
+      </w:r>
+      <w:proofErr w:type="spellStart"/>
+      <w:r>
+        <w:rPr>
+          <w:rFonts w:ascii="Arial" w:hAnsi="Arial" w:cs="Arial"/>
+          <w:lang w:val="es-MX"/>
+        </w:rPr>
+        <w:t>apellido_entrenador</w:t>
+      </w:r>
+      <w:proofErr w:type="spellEnd"/>
+      <w:r>
+        <w:rPr>
+          <w:rFonts w:ascii="Arial" w:hAnsi="Arial" w:cs="Arial"/>
+          <w:lang w:val="es-MX"/>
+        </w:rPr>
+        <w:t>.</w:t>
       </w:r>
     </w:p>
     <w:p>
       <w:pPr>
-        <w:rPr>
-          <w:lang w:val="es-MX"/>
-        </w:rPr>
-      </w:pPr>
-      <w:r>
-        <w:rPr>
-          <w:lang w:val="es-MX"/>
-        </w:rPr>
-        <w:t>De la tabla wods usamos las columnas tipo como tipo_wod y duración.</w:t>
+        <w:jc w:val="both"/>
+        <w:rPr>
+          <w:rFonts w:ascii="Arial" w:hAnsi="Arial" w:cs="Arial"/>
+          <w:lang w:val="es-MX"/>
+        </w:rPr>
+      </w:pPr>
+      <w:r>
+        <w:rPr>
+          <w:rFonts w:ascii="Arial" w:hAnsi="Arial" w:cs="Arial"/>
+          <w:lang w:val="es-MX"/>
+        </w:rPr>
+        <w:t xml:space="preserve">De la tabla </w:t>
+      </w:r>
+      <w:proofErr w:type="spellStart"/>
+      <w:r>
+        <w:rPr>
+          <w:rFonts w:ascii="Arial" w:hAnsi="Arial" w:cs="Arial"/>
+          <w:lang w:val="es-MX"/>
+        </w:rPr>
+        <w:t>wods</w:t>
+      </w:r>
+      <w:proofErr w:type="spellEnd"/>
+      <w:r>
+        <w:rPr>
+          <w:rFonts w:ascii="Arial" w:hAnsi="Arial" w:cs="Arial"/>
+          <w:lang w:val="es-MX"/>
+        </w:rPr>
+        <w:t xml:space="preserve"> usamos las columnas tipo como </w:t>
+      </w:r>
+      <w:proofErr w:type="spellStart"/>
+      <w:r>
+        <w:rPr>
+          <w:rFonts w:ascii="Arial" w:hAnsi="Arial" w:cs="Arial"/>
+          <w:lang w:val="es-MX"/>
+        </w:rPr>
+        <w:t>tipo_wod</w:t>
+      </w:r>
+      <w:proofErr w:type="spellEnd"/>
+      <w:r>
+        <w:rPr>
+          <w:rFonts w:ascii="Arial" w:hAnsi="Arial" w:cs="Arial"/>
+          <w:lang w:val="es-MX"/>
+        </w:rPr>
+        <w:t xml:space="preserve"> y duración.</w:t>
       </w:r>
     </w:p>
     <w:p>
@@ -5041,70 +5386,166 @@
           <w:ilvl w:val="0"/>
           <w:numId w:val="1"/>
         </w:numPr>
-        <w:rPr>
+        <w:jc w:val="both"/>
+        <w:rPr>
+          <w:rFonts w:ascii="Arial" w:hAnsi="Arial" w:cs="Arial"/>
           <w:b/>
           <w:bCs/>
           <w:lang w:val="es-MX"/>
         </w:rPr>
       </w:pPr>
-      <w:r>
-        <w:rPr>
+      <w:proofErr w:type="spellStart"/>
+      <w:r>
+        <w:rPr>
+          <w:rFonts w:ascii="Arial" w:hAnsi="Arial" w:cs="Arial"/>
           <w:b/>
           <w:bCs/>
           <w:lang w:val="es-MX"/>
         </w:rPr>
         <w:t>Vista_reservas_por_clase</w:t>
       </w:r>
+      <w:proofErr w:type="spellEnd"/>
     </w:p>
     <w:p>
       <w:pPr>
-        <w:rPr>
-          <w:lang w:val="es-MX"/>
-        </w:rPr>
-      </w:pPr>
-      <w:r>
-        <w:rPr>
+        <w:jc w:val="both"/>
+        <w:rPr>
+          <w:rFonts w:ascii="Arial" w:hAnsi="Arial" w:cs="Arial"/>
+          <w:lang w:val="es-MX"/>
+        </w:rPr>
+      </w:pPr>
+      <w:r>
+        <w:rPr>
+          <w:rFonts w:ascii="Arial" w:hAnsi="Arial" w:cs="Arial"/>
           <w:lang w:val="es-MX"/>
         </w:rPr>
         <w:t>El objetivo es saber cuántos inscriptos tiene cada clase así nos sirve para controlar cupos</w:t>
       </w:r>
       <w:r>
         <w:rPr>
+          <w:rFonts w:ascii="Arial" w:hAnsi="Arial" w:cs="Arial"/>
           <w:lang w:val="es-MX"/>
         </w:rPr>
         <w:t>. Necesito las tablas</w:t>
       </w:r>
       <w:r>
         <w:rPr>
-          <w:lang w:val="es-MX"/>
-        </w:rPr>
-        <w:t xml:space="preserve"> clases y reservas, hacer un JOIN y luego agrupar por clase con un GROUP BY; hacer un count de reservas para que me cuente el número de reservas.</w:t>
+          <w:rFonts w:ascii="Arial" w:hAnsi="Arial" w:cs="Arial"/>
+          <w:lang w:val="es-MX"/>
+        </w:rPr>
+        <w:t xml:space="preserve"> clases y reservas, hacer un JOIN y luego agrupar por clase con un GROUP BY; hacer un </w:t>
+      </w:r>
+      <w:proofErr w:type="spellStart"/>
+      <w:r>
+        <w:rPr>
+          <w:rFonts w:ascii="Arial" w:hAnsi="Arial" w:cs="Arial"/>
+          <w:lang w:val="es-MX"/>
+        </w:rPr>
+        <w:t>count</w:t>
+      </w:r>
+      <w:proofErr w:type="spellEnd"/>
+      <w:r>
+        <w:rPr>
+          <w:rFonts w:ascii="Arial" w:hAnsi="Arial" w:cs="Arial"/>
+          <w:lang w:val="es-MX"/>
+        </w:rPr>
+        <w:t xml:space="preserve"> de reservas para que me cuente el número de reservas.</w:t>
       </w:r>
     </w:p>
     <w:p>
       <w:pPr>
-        <w:rPr>
-          <w:lang w:val="es-MX"/>
-        </w:rPr>
-      </w:pPr>
-      <w:r>
-        <w:rPr>
-          <w:lang w:val="es-MX"/>
-        </w:rPr>
-        <w:t>Necesito de la tabla clases las columnas: id_clase, fecha, hora y tipo_clase.</w:t>
+        <w:jc w:val="both"/>
+        <w:rPr>
+          <w:rFonts w:ascii="Arial" w:hAnsi="Arial" w:cs="Arial"/>
+          <w:lang w:val="es-MX"/>
+        </w:rPr>
+      </w:pPr>
+      <w:r>
+        <w:rPr>
+          <w:rFonts w:ascii="Arial" w:hAnsi="Arial" w:cs="Arial"/>
+          <w:lang w:val="es-MX"/>
+        </w:rPr>
+        <w:t xml:space="preserve">Necesito de la tabla clases las columnas: </w:t>
+      </w:r>
+      <w:proofErr w:type="spellStart"/>
+      <w:r>
+        <w:rPr>
+          <w:rFonts w:ascii="Arial" w:hAnsi="Arial" w:cs="Arial"/>
+          <w:lang w:val="es-MX"/>
+        </w:rPr>
+        <w:t>id_clase</w:t>
+      </w:r>
+      <w:proofErr w:type="spellEnd"/>
+      <w:r>
+        <w:rPr>
+          <w:rFonts w:ascii="Arial" w:hAnsi="Arial" w:cs="Arial"/>
+          <w:lang w:val="es-MX"/>
+        </w:rPr>
+        <w:t xml:space="preserve">, fecha, hora y </w:t>
+      </w:r>
+      <w:proofErr w:type="spellStart"/>
+      <w:r>
+        <w:rPr>
+          <w:rFonts w:ascii="Arial" w:hAnsi="Arial" w:cs="Arial"/>
+          <w:lang w:val="es-MX"/>
+        </w:rPr>
+        <w:t>tipo_clase</w:t>
+      </w:r>
+      <w:proofErr w:type="spellEnd"/>
+      <w:r>
+        <w:rPr>
+          <w:rFonts w:ascii="Arial" w:hAnsi="Arial" w:cs="Arial"/>
+          <w:lang w:val="es-MX"/>
+        </w:rPr>
+        <w:t>.</w:t>
       </w:r>
     </w:p>
     <w:p>
       <w:pPr>
-        <w:rPr>
-          <w:lang w:val="es-MX"/>
-        </w:rPr>
-      </w:pPr>
-      <w:r>
-        <w:rPr>
-          <w:lang w:val="es-MX"/>
-        </w:rPr>
-        <w:t>De la tabla reservas uso la columna id_reserva para hacer el count.</w:t>
+        <w:jc w:val="both"/>
+        <w:rPr>
+          <w:rFonts w:ascii="Arial" w:hAnsi="Arial" w:cs="Arial"/>
+          <w:lang w:val="es-MX"/>
+        </w:rPr>
+      </w:pPr>
+      <w:r>
+        <w:rPr>
+          <w:rFonts w:ascii="Arial" w:hAnsi="Arial" w:cs="Arial"/>
+          <w:lang w:val="es-MX"/>
+        </w:rPr>
+        <w:t xml:space="preserve">De la tabla reservas uso la columna </w:t>
+      </w:r>
+      <w:proofErr w:type="spellStart"/>
+      <w:r>
+        <w:rPr>
+          <w:rFonts w:ascii="Arial" w:hAnsi="Arial" w:cs="Arial"/>
+          <w:lang w:val="es-MX"/>
+        </w:rPr>
+        <w:t>id_reserva</w:t>
+      </w:r>
+      <w:proofErr w:type="spellEnd"/>
+      <w:r>
+        <w:rPr>
+          <w:rFonts w:ascii="Arial" w:hAnsi="Arial" w:cs="Arial"/>
+          <w:lang w:val="es-MX"/>
+        </w:rPr>
+        <w:t xml:space="preserve"> para hacer el </w:t>
+      </w:r>
+      <w:proofErr w:type="spellStart"/>
+      <w:r>
+        <w:rPr>
+          <w:rFonts w:ascii="Arial" w:hAnsi="Arial" w:cs="Arial"/>
+          <w:lang w:val="es-MX"/>
+        </w:rPr>
+        <w:t>count</w:t>
+      </w:r>
+      <w:proofErr w:type="spellEnd"/>
+      <w:r>
+        <w:rPr>
+          <w:rFonts w:ascii="Arial" w:hAnsi="Arial" w:cs="Arial"/>
+          <w:lang w:val="es-MX"/>
+        </w:rPr>
+        <w:t>.</w:t>
       </w:r>
     </w:p>
     <w:p>
@@ -5114,36 +5555,45 @@
           <w:ilvl w:val="0"/>
           <w:numId w:val="1"/>
         </w:numPr>
-        <w:rPr>
+        <w:jc w:val="both"/>
+        <w:rPr>
+          <w:rFonts w:ascii="Arial" w:hAnsi="Arial" w:cs="Arial"/>
           <w:b/>
           <w:bCs/>
           <w:lang w:val="es-MX"/>
         </w:rPr>
       </w:pPr>
-      <w:r>
-        <w:rPr>
+      <w:proofErr w:type="spellStart"/>
+      <w:r>
+        <w:rPr>
+          <w:rFonts w:ascii="Arial" w:hAnsi="Arial" w:cs="Arial"/>
           <w:b/>
           <w:bCs/>
           <w:lang w:val="es-MX"/>
         </w:rPr>
-        <w:lastRenderedPageBreak/>
         <w:t>Vista_clientes_membresias</w:t>
       </w:r>
+      <w:proofErr w:type="spellEnd"/>
     </w:p>
     <w:p>
       <w:pPr>
-        <w:rPr>
-          <w:lang w:val="es-MX"/>
-        </w:rPr>
-      </w:pPr>
-      <w:r>
-        <w:rPr>
-          <w:lang w:val="es-MX"/>
-        </w:rPr>
+        <w:jc w:val="both"/>
+        <w:rPr>
+          <w:rFonts w:ascii="Arial" w:hAnsi="Arial" w:cs="Arial"/>
+          <w:lang w:val="es-MX"/>
+        </w:rPr>
+      </w:pPr>
+      <w:r>
+        <w:rPr>
+          <w:rFonts w:ascii="Arial" w:hAnsi="Arial" w:cs="Arial"/>
+          <w:lang w:val="es-MX"/>
+        </w:rPr>
+        <w:lastRenderedPageBreak/>
         <w:t>El objetivo es ver qué membresía tiene cada cliente. Necesitamos las tablas clientes y membresías.</w:t>
       </w:r>
       <w:r>
         <w:rPr>
+          <w:rFonts w:ascii="Arial" w:hAnsi="Arial" w:cs="Arial"/>
           <w:lang w:val="es-MX"/>
         </w:rPr>
         <w:t xml:space="preserve"> Nos sirve para hacer un seguimiento de planes activos.</w:t>
@@ -5151,18 +5601,86 @@
     </w:p>
     <w:p>
       <w:pPr>
-        <w:rPr>
-          <w:lang w:val="es-MX"/>
-        </w:rPr>
-      </w:pPr>
-      <w:r>
-        <w:rPr>
-          <w:lang w:val="es-MX"/>
-        </w:rPr>
-        <w:t>De la tabla clientes usamos las columnas id_cliente, nombre, apellido, y de la tabla membresías usamos las columnas nombre como nombre_membresia, precio, duración_dias y limite_clases.</w:t>
-      </w:r>
-      <w:r>
-        <w:rPr>
+        <w:jc w:val="both"/>
+        <w:rPr>
+          <w:rFonts w:ascii="Arial" w:hAnsi="Arial" w:cs="Arial"/>
+          <w:lang w:val="es-MX"/>
+        </w:rPr>
+      </w:pPr>
+      <w:r>
+        <w:rPr>
+          <w:rFonts w:ascii="Arial" w:hAnsi="Arial" w:cs="Arial"/>
+          <w:lang w:val="es-MX"/>
+        </w:rPr>
+        <w:t xml:space="preserve">De la tabla clientes usamos las columnas </w:t>
+      </w:r>
+      <w:proofErr w:type="spellStart"/>
+      <w:r>
+        <w:rPr>
+          <w:rFonts w:ascii="Arial" w:hAnsi="Arial" w:cs="Arial"/>
+          <w:lang w:val="es-MX"/>
+        </w:rPr>
+        <w:t>id_cliente</w:t>
+      </w:r>
+      <w:proofErr w:type="spellEnd"/>
+      <w:r>
+        <w:rPr>
+          <w:rFonts w:ascii="Arial" w:hAnsi="Arial" w:cs="Arial"/>
+          <w:lang w:val="es-MX"/>
+        </w:rPr>
+        <w:t xml:space="preserve">, nombre, apellido, y de la tabla membresías usamos las columnas nombre como </w:t>
+      </w:r>
+      <w:proofErr w:type="spellStart"/>
+      <w:r>
+        <w:rPr>
+          <w:rFonts w:ascii="Arial" w:hAnsi="Arial" w:cs="Arial"/>
+          <w:lang w:val="es-MX"/>
+        </w:rPr>
+        <w:t>nombre_membresia</w:t>
+      </w:r>
+      <w:proofErr w:type="spellEnd"/>
+      <w:r>
+        <w:rPr>
+          <w:rFonts w:ascii="Arial" w:hAnsi="Arial" w:cs="Arial"/>
+          <w:lang w:val="es-MX"/>
+        </w:rPr>
+        <w:t xml:space="preserve">, precio, </w:t>
+      </w:r>
+      <w:proofErr w:type="spellStart"/>
+      <w:r>
+        <w:rPr>
+          <w:rFonts w:ascii="Arial" w:hAnsi="Arial" w:cs="Arial"/>
+          <w:lang w:val="es-MX"/>
+        </w:rPr>
+        <w:t>duración_dias</w:t>
+      </w:r>
+      <w:proofErr w:type="spellEnd"/>
+      <w:r>
+        <w:rPr>
+          <w:rFonts w:ascii="Arial" w:hAnsi="Arial" w:cs="Arial"/>
+          <w:lang w:val="es-MX"/>
+        </w:rPr>
+        <w:t xml:space="preserve"> y </w:t>
+      </w:r>
+      <w:proofErr w:type="spellStart"/>
+      <w:r>
+        <w:rPr>
+          <w:rFonts w:ascii="Arial" w:hAnsi="Arial" w:cs="Arial"/>
+          <w:lang w:val="es-MX"/>
+        </w:rPr>
+        <w:t>limite_clases</w:t>
+      </w:r>
+      <w:proofErr w:type="spellEnd"/>
+      <w:r>
+        <w:rPr>
+          <w:rFonts w:ascii="Arial" w:hAnsi="Arial" w:cs="Arial"/>
+          <w:lang w:val="es-MX"/>
+        </w:rPr>
+        <w:t>.</w:t>
+      </w:r>
+      <w:r>
+        <w:rPr>
+          <w:rFonts w:ascii="Arial" w:hAnsi="Arial" w:cs="Arial"/>
           <w:lang w:val="es-MX"/>
         </w:rPr>
         <w:t xml:space="preserve"> Hacemos un JOIN de las 2 tablas.</w:t>
@@ -5170,29 +5688,844 @@
     </w:p>
     <w:p>
       <w:pPr>
-        <w:rPr>
-          <w:lang w:val="es-MX"/>
-        </w:rPr>
-      </w:pPr>
+        <w:pStyle w:val="Prrafodelista"/>
+        <w:numPr>
+          <w:ilvl w:val="0"/>
+          <w:numId w:val="1"/>
+        </w:numPr>
+        <w:jc w:val="both"/>
+        <w:rPr>
+          <w:rFonts w:ascii="Arial" w:hAnsi="Arial" w:cs="Arial"/>
+          <w:b/>
+          <w:bCs/>
+          <w:lang w:val="es-MX"/>
+        </w:rPr>
+      </w:pPr>
+      <w:proofErr w:type="spellStart"/>
+      <w:r>
+        <w:rPr>
+          <w:rFonts w:ascii="Arial" w:hAnsi="Arial" w:cs="Arial"/>
+          <w:b/>
+          <w:bCs/>
+          <w:lang w:val="es-MX"/>
+        </w:rPr>
+        <w:t>Vista_pagos_clientes</w:t>
+      </w:r>
+      <w:proofErr w:type="spellEnd"/>
     </w:p>
     <w:p>
       <w:pPr>
-        <w:rPr>
-          <w:lang w:val="es-MX"/>
-        </w:rPr>
-      </w:pPr>
+        <w:jc w:val="both"/>
+        <w:rPr>
+          <w:rFonts w:ascii="Arial" w:hAnsi="Arial" w:cs="Arial"/>
+          <w:lang w:val="es-MX"/>
+        </w:rPr>
+      </w:pPr>
+      <w:r>
+        <w:rPr>
+          <w:rFonts w:ascii="Arial" w:hAnsi="Arial" w:cs="Arial"/>
+          <w:lang w:val="es-MX"/>
+        </w:rPr>
+        <w:t xml:space="preserve">El objetivo es ver el historial de pagos. Usamos las tablas clientes, pagos y membresías y hacemos un JOIN. </w:t>
+      </w:r>
     </w:p>
     <w:p>
       <w:pPr>
-        <w:rPr>
-          <w:lang w:val="es-MX"/>
-        </w:rPr>
-      </w:pPr>
+        <w:jc w:val="both"/>
+        <w:rPr>
+          <w:rFonts w:ascii="Arial" w:hAnsi="Arial" w:cs="Arial"/>
+          <w:lang w:val="es-MX"/>
+        </w:rPr>
+      </w:pPr>
+      <w:r>
+        <w:rPr>
+          <w:rFonts w:ascii="Arial" w:hAnsi="Arial" w:cs="Arial"/>
+          <w:lang w:val="es-MX"/>
+        </w:rPr>
+        <w:t>De la tabla clientes usamos las columnas nombre, apellido.</w:t>
+      </w:r>
     </w:p>
     <w:p>
       <w:pPr>
-        <w:rPr>
-          <w:lang w:val="es-MX"/>
+        <w:jc w:val="both"/>
+        <w:rPr>
+          <w:rFonts w:ascii="Arial" w:hAnsi="Arial" w:cs="Arial"/>
+          <w:lang w:val="es-MX"/>
+        </w:rPr>
+      </w:pPr>
+      <w:r>
+        <w:rPr>
+          <w:rFonts w:ascii="Arial" w:hAnsi="Arial" w:cs="Arial"/>
+          <w:lang w:val="es-MX"/>
+        </w:rPr>
+        <w:t xml:space="preserve">De la tabla pagos usamos las columnas </w:t>
+      </w:r>
+      <w:proofErr w:type="spellStart"/>
+      <w:r>
+        <w:rPr>
+          <w:rFonts w:ascii="Arial" w:hAnsi="Arial" w:cs="Arial"/>
+          <w:lang w:val="es-MX"/>
+        </w:rPr>
+        <w:t>id_pago</w:t>
+      </w:r>
+      <w:proofErr w:type="spellEnd"/>
+      <w:r>
+        <w:rPr>
+          <w:rFonts w:ascii="Arial" w:hAnsi="Arial" w:cs="Arial"/>
+          <w:lang w:val="es-MX"/>
+        </w:rPr>
+        <w:t xml:space="preserve">, </w:t>
+      </w:r>
+      <w:proofErr w:type="spellStart"/>
+      <w:r>
+        <w:rPr>
+          <w:rFonts w:ascii="Arial" w:hAnsi="Arial" w:cs="Arial"/>
+          <w:lang w:val="es-MX"/>
+        </w:rPr>
+        <w:t>fecha_pago</w:t>
+      </w:r>
+      <w:proofErr w:type="spellEnd"/>
+      <w:r>
+        <w:rPr>
+          <w:rFonts w:ascii="Arial" w:hAnsi="Arial" w:cs="Arial"/>
+          <w:lang w:val="es-MX"/>
+        </w:rPr>
+        <w:t xml:space="preserve">, </w:t>
+      </w:r>
+      <w:proofErr w:type="spellStart"/>
+      <w:r>
+        <w:rPr>
+          <w:rFonts w:ascii="Arial" w:hAnsi="Arial" w:cs="Arial"/>
+          <w:lang w:val="es-MX"/>
+        </w:rPr>
+        <w:t>método_pago</w:t>
+      </w:r>
+      <w:proofErr w:type="spellEnd"/>
+      <w:r>
+        <w:rPr>
+          <w:rFonts w:ascii="Arial" w:hAnsi="Arial" w:cs="Arial"/>
+          <w:lang w:val="es-MX"/>
+        </w:rPr>
+        <w:t>.</w:t>
+      </w:r>
+    </w:p>
+    <w:p>
+      <w:pPr>
+        <w:jc w:val="both"/>
+        <w:rPr>
+          <w:rFonts w:ascii="Arial" w:hAnsi="Arial" w:cs="Arial"/>
+          <w:lang w:val="es-MX"/>
+        </w:rPr>
+      </w:pPr>
+      <w:r>
+        <w:rPr>
+          <w:rFonts w:ascii="Arial" w:hAnsi="Arial" w:cs="Arial"/>
+          <w:lang w:val="es-MX"/>
+        </w:rPr>
+        <w:t xml:space="preserve">De la tabla membresías usamos las columnas </w:t>
+      </w:r>
+      <w:r>
+        <w:rPr>
+          <w:rFonts w:ascii="Arial" w:hAnsi="Arial" w:cs="Arial"/>
+          <w:lang w:val="es-MX"/>
+        </w:rPr>
+        <w:t xml:space="preserve">nombre como </w:t>
+      </w:r>
+      <w:proofErr w:type="spellStart"/>
+      <w:r>
+        <w:rPr>
+          <w:rFonts w:ascii="Arial" w:hAnsi="Arial" w:cs="Arial"/>
+          <w:lang w:val="es-MX"/>
+        </w:rPr>
+        <w:t>nombre_membresia</w:t>
+      </w:r>
+      <w:proofErr w:type="spellEnd"/>
+      <w:r>
+        <w:rPr>
+          <w:rFonts w:ascii="Arial" w:hAnsi="Arial" w:cs="Arial"/>
+          <w:lang w:val="es-MX"/>
+        </w:rPr>
+        <w:t>, y la columna precio.</w:t>
+      </w:r>
+    </w:p>
+    <w:p>
+      <w:pPr>
+        <w:jc w:val="both"/>
+        <w:rPr>
+          <w:rFonts w:ascii="Arial" w:hAnsi="Arial" w:cs="Arial"/>
+          <w:b/>
+          <w:bCs/>
+          <w:lang w:val="es-MX"/>
+        </w:rPr>
+      </w:pPr>
+    </w:p>
+    <w:p>
+      <w:pPr>
+        <w:jc w:val="both"/>
+        <w:rPr>
+          <w:rFonts w:ascii="Arial" w:hAnsi="Arial" w:cs="Arial"/>
+          <w:b/>
+          <w:bCs/>
+          <w:lang w:val="es-MX"/>
+        </w:rPr>
+      </w:pPr>
+      <w:r>
+        <w:rPr>
+          <w:rFonts w:ascii="Arial" w:hAnsi="Arial" w:cs="Arial"/>
+          <w:b/>
+          <w:bCs/>
+          <w:lang w:val="es-MX"/>
+        </w:rPr>
+        <w:t>FUNCIONES</w:t>
+      </w:r>
+    </w:p>
+    <w:p>
+      <w:pPr>
+        <w:pStyle w:val="Prrafodelista"/>
+        <w:numPr>
+          <w:ilvl w:val="0"/>
+          <w:numId w:val="3"/>
+        </w:numPr>
+        <w:jc w:val="both"/>
+        <w:rPr>
+          <w:rFonts w:ascii="Arial" w:hAnsi="Arial" w:cs="Arial"/>
+          <w:b/>
+          <w:bCs/>
+          <w:lang w:val="es-MX"/>
+        </w:rPr>
+      </w:pPr>
+      <w:r>
+        <w:rPr>
+          <w:rFonts w:ascii="Arial" w:hAnsi="Arial" w:cs="Arial"/>
+          <w:b/>
+          <w:bCs/>
+          <w:lang w:val="es-MX"/>
+        </w:rPr>
+        <w:t>Calcular la edad de un cliente</w:t>
+      </w:r>
+    </w:p>
+    <w:p>
+      <w:pPr>
+        <w:jc w:val="both"/>
+        <w:rPr>
+          <w:rFonts w:ascii="Arial" w:hAnsi="Arial" w:cs="Arial"/>
+          <w:lang w:val="es-MX"/>
+        </w:rPr>
+      </w:pPr>
+      <w:r>
+        <w:rPr>
+          <w:rFonts w:ascii="Arial" w:hAnsi="Arial" w:cs="Arial"/>
+          <w:lang w:val="es-MX"/>
+        </w:rPr>
+        <w:t xml:space="preserve">Calcula la edad en años a partir de </w:t>
+      </w:r>
+      <w:proofErr w:type="spellStart"/>
+      <w:r>
+        <w:rPr>
+          <w:rFonts w:ascii="Arial" w:hAnsi="Arial" w:cs="Arial"/>
+          <w:lang w:val="es-MX"/>
+        </w:rPr>
+        <w:t>fecha_nacimiento</w:t>
+      </w:r>
+      <w:proofErr w:type="spellEnd"/>
+      <w:r>
+        <w:rPr>
+          <w:rFonts w:ascii="Arial" w:hAnsi="Arial" w:cs="Arial"/>
+          <w:lang w:val="es-MX"/>
+        </w:rPr>
+        <w:t>.</w:t>
+      </w:r>
+    </w:p>
+    <w:p>
+      <w:pPr>
+        <w:pStyle w:val="Prrafodelista"/>
+        <w:numPr>
+          <w:ilvl w:val="0"/>
+          <w:numId w:val="3"/>
+        </w:numPr>
+        <w:jc w:val="both"/>
+        <w:rPr>
+          <w:rFonts w:ascii="Arial" w:hAnsi="Arial" w:cs="Arial"/>
+          <w:b/>
+          <w:bCs/>
+          <w:lang w:val="es-MX"/>
+        </w:rPr>
+      </w:pPr>
+      <w:r>
+        <w:rPr>
+          <w:rFonts w:ascii="Arial" w:hAnsi="Arial" w:cs="Arial"/>
+          <w:b/>
+          <w:bCs/>
+          <w:lang w:val="es-MX"/>
+        </w:rPr>
+        <w:t>Cantidad de clases reservadas por un cliente</w:t>
+      </w:r>
+    </w:p>
+    <w:p>
+      <w:pPr>
+        <w:jc w:val="both"/>
+        <w:rPr>
+          <w:rFonts w:ascii="Arial" w:hAnsi="Arial" w:cs="Arial"/>
+          <w:lang w:val="es-MX"/>
+        </w:rPr>
+      </w:pPr>
+      <w:r>
+        <w:rPr>
+          <w:rFonts w:ascii="Arial" w:hAnsi="Arial" w:cs="Arial"/>
+          <w:lang w:val="es-MX"/>
+        </w:rPr>
+        <w:t>Nos devuelve cuántas reservas realizó un cliente</w:t>
+      </w:r>
+    </w:p>
+    <w:p>
+      <w:pPr>
+        <w:jc w:val="both"/>
+        <w:rPr>
+          <w:rFonts w:ascii="Arial" w:hAnsi="Arial" w:cs="Arial"/>
+          <w:b/>
+          <w:bCs/>
+          <w:lang w:val="es-MX"/>
+        </w:rPr>
+      </w:pPr>
+    </w:p>
+    <w:p>
+      <w:pPr>
+        <w:jc w:val="both"/>
+        <w:rPr>
+          <w:rFonts w:ascii="Arial" w:hAnsi="Arial" w:cs="Arial"/>
+          <w:b/>
+          <w:bCs/>
+          <w:lang w:val="es-MX"/>
+        </w:rPr>
+      </w:pPr>
+      <w:r>
+        <w:rPr>
+          <w:rFonts w:ascii="Arial" w:hAnsi="Arial" w:cs="Arial"/>
+          <w:b/>
+          <w:bCs/>
+          <w:lang w:val="es-MX"/>
+        </w:rPr>
+        <w:t>TRIGGERS</w:t>
+      </w:r>
+    </w:p>
+    <w:p>
+      <w:pPr>
+        <w:pStyle w:val="Prrafodelista"/>
+        <w:numPr>
+          <w:ilvl w:val="0"/>
+          <w:numId w:val="4"/>
+        </w:numPr>
+        <w:jc w:val="both"/>
+        <w:rPr>
+          <w:rFonts w:ascii="Arial" w:hAnsi="Arial" w:cs="Arial"/>
+          <w:b/>
+          <w:bCs/>
+          <w:lang w:val="es-MX"/>
+        </w:rPr>
+      </w:pPr>
+      <w:r>
+        <w:rPr>
+          <w:rFonts w:ascii="Arial" w:hAnsi="Arial" w:cs="Arial"/>
+          <w:b/>
+          <w:bCs/>
+          <w:lang w:val="es-MX"/>
+        </w:rPr>
+        <w:t>Evitar sobrepasar el cupo máximo de una clase</w:t>
+      </w:r>
+    </w:p>
+    <w:p>
+      <w:pPr>
+        <w:jc w:val="both"/>
+        <w:rPr>
+          <w:rFonts w:ascii="Arial" w:hAnsi="Arial" w:cs="Arial"/>
+          <w:lang w:val="es-MX"/>
+        </w:rPr>
+      </w:pPr>
+      <w:r>
+        <w:rPr>
+          <w:rFonts w:ascii="Arial" w:hAnsi="Arial" w:cs="Arial"/>
+          <w:lang w:val="es-MX"/>
+        </w:rPr>
+        <w:t>Nos sirve porque no nos permitirá hacer reservas si la clase ya alcanzó su cupo. Usamos la tabla reservas y el tipo BEFORE INSERT ya que necesitamos que antes de que se inserte un dato en la tabla reservas, o sea antes de que un cliente pueda reservar una clase</w:t>
+      </w:r>
+      <w:r>
+        <w:rPr>
+          <w:rFonts w:ascii="Arial" w:hAnsi="Arial" w:cs="Arial"/>
+          <w:lang w:val="es-MX"/>
+        </w:rPr>
+        <w:t xml:space="preserve"> (antes que se inserte una nueva fila en la tabla reservas),</w:t>
+      </w:r>
+      <w:r>
+        <w:rPr>
+          <w:rFonts w:ascii="Arial" w:hAnsi="Arial" w:cs="Arial"/>
+          <w:lang w:val="es-MX"/>
+        </w:rPr>
+        <w:t xml:space="preserve"> no nos deje hacerlo si el cupo de esa clase está lleno.</w:t>
+      </w:r>
+      <w:r>
+        <w:rPr>
+          <w:rFonts w:ascii="Arial" w:hAnsi="Arial" w:cs="Arial"/>
+          <w:lang w:val="es-MX"/>
+        </w:rPr>
+        <w:t xml:space="preserve"> El FOR EACH ROW es que se ejecuta una vez por cada fila agregada (reserva) que se intenta insertar.</w:t>
+      </w:r>
+    </w:p>
+    <w:p>
+      <w:pPr>
+        <w:jc w:val="both"/>
+        <w:rPr>
+          <w:rFonts w:ascii="Arial" w:hAnsi="Arial" w:cs="Arial"/>
+          <w:lang w:val="es-MX"/>
+        </w:rPr>
+      </w:pPr>
+      <w:r>
+        <w:rPr>
+          <w:rFonts w:ascii="Arial" w:hAnsi="Arial" w:cs="Arial"/>
+          <w:lang w:val="es-MX"/>
+        </w:rPr>
+        <w:t xml:space="preserve">Si el </w:t>
+      </w:r>
+      <w:proofErr w:type="spellStart"/>
+      <w:r>
+        <w:rPr>
+          <w:rFonts w:ascii="Arial" w:hAnsi="Arial" w:cs="Arial"/>
+          <w:lang w:val="es-MX"/>
+        </w:rPr>
+        <w:t>trigger</w:t>
+      </w:r>
+      <w:proofErr w:type="spellEnd"/>
+      <w:r>
+        <w:rPr>
+          <w:rFonts w:ascii="Arial" w:hAnsi="Arial" w:cs="Arial"/>
+          <w:lang w:val="es-MX"/>
+        </w:rPr>
+        <w:t xml:space="preserve"> falla, la reserva no se guarda.</w:t>
+      </w:r>
+    </w:p>
+    <w:p>
+      <w:pPr>
+        <w:jc w:val="both"/>
+        <w:rPr>
+          <w:rFonts w:ascii="Arial" w:hAnsi="Arial" w:cs="Arial"/>
+          <w:lang w:val="es-MX"/>
+        </w:rPr>
+      </w:pPr>
+      <w:r>
+        <w:rPr>
+          <w:rFonts w:ascii="Arial" w:hAnsi="Arial" w:cs="Arial"/>
+          <w:lang w:val="es-MX"/>
+        </w:rPr>
+        <w:t xml:space="preserve">Este </w:t>
+      </w:r>
+      <w:proofErr w:type="spellStart"/>
+      <w:r>
+        <w:rPr>
+          <w:rFonts w:ascii="Arial" w:hAnsi="Arial" w:cs="Arial"/>
+          <w:lang w:val="es-MX"/>
+        </w:rPr>
+        <w:t>trigger</w:t>
+      </w:r>
+      <w:proofErr w:type="spellEnd"/>
+      <w:r>
+        <w:rPr>
+          <w:rFonts w:ascii="Arial" w:hAnsi="Arial" w:cs="Arial"/>
+          <w:lang w:val="es-MX"/>
+        </w:rPr>
+        <w:t xml:space="preserve"> nos garantiza la integridad del negocio porque evita que se registren más reservas que el cupo permitido</w:t>
+      </w:r>
+      <w:r>
+        <w:rPr>
+          <w:rFonts w:ascii="Arial" w:hAnsi="Arial" w:cs="Arial"/>
+          <w:lang w:val="es-MX"/>
+        </w:rPr>
+        <w:t xml:space="preserve"> así se controla que no se exceda el cupo máximo de una clase antes de registrar una reserva.</w:t>
+      </w:r>
+    </w:p>
+    <w:p>
+      <w:pPr>
+        <w:pStyle w:val="Prrafodelista"/>
+        <w:numPr>
+          <w:ilvl w:val="0"/>
+          <w:numId w:val="4"/>
+        </w:numPr>
+        <w:jc w:val="both"/>
+        <w:rPr>
+          <w:rFonts w:ascii="Arial" w:hAnsi="Arial" w:cs="Arial"/>
+          <w:b/>
+          <w:bCs/>
+          <w:lang w:val="es-MX"/>
+        </w:rPr>
+      </w:pPr>
+      <w:r>
+        <w:rPr>
+          <w:rFonts w:ascii="Arial" w:hAnsi="Arial" w:cs="Arial"/>
+          <w:b/>
+          <w:bCs/>
+          <w:lang w:val="es-MX"/>
+        </w:rPr>
+        <w:t>Activar un cliente automáticamente al registrar un pago</w:t>
+      </w:r>
+    </w:p>
+    <w:p>
+      <w:pPr>
+        <w:jc w:val="both"/>
+        <w:rPr>
+          <w:rFonts w:ascii="Arial" w:hAnsi="Arial" w:cs="Arial"/>
+          <w:lang w:val="es-MX"/>
+        </w:rPr>
+      </w:pPr>
+      <w:r>
+        <w:rPr>
+          <w:rFonts w:ascii="Arial" w:hAnsi="Arial" w:cs="Arial"/>
+          <w:lang w:val="es-MX"/>
+        </w:rPr>
+        <w:t xml:space="preserve">El objetivo de este </w:t>
+      </w:r>
+      <w:proofErr w:type="spellStart"/>
+      <w:r>
+        <w:rPr>
+          <w:rFonts w:ascii="Arial" w:hAnsi="Arial" w:cs="Arial"/>
+          <w:lang w:val="es-MX"/>
+        </w:rPr>
+        <w:t>trigger</w:t>
+      </w:r>
+      <w:proofErr w:type="spellEnd"/>
+      <w:r>
+        <w:rPr>
+          <w:rFonts w:ascii="Arial" w:hAnsi="Arial" w:cs="Arial"/>
+          <w:lang w:val="es-MX"/>
+        </w:rPr>
+        <w:t xml:space="preserve"> es cambiar el estado del cliente a Activo cuando realice un pago. Usamos la tabla pagos. Es de tipo AFTER INSERT porque una vez que el cliente realice el pago (se inserte un dato en la tabla pagos), recién cambia su estado de inactivo a activo.</w:t>
+      </w:r>
+      <w:r>
+        <w:rPr>
+          <w:rFonts w:ascii="Arial" w:hAnsi="Arial" w:cs="Arial"/>
+          <w:lang w:val="es-MX"/>
+        </w:rPr>
+        <w:t xml:space="preserve"> </w:t>
+      </w:r>
+      <w:r>
+        <w:rPr>
+          <w:rFonts w:ascii="Arial" w:hAnsi="Arial" w:cs="Arial"/>
+          <w:lang w:val="es-MX"/>
+        </w:rPr>
+        <w:lastRenderedPageBreak/>
+        <w:t>Así activa automáticamente al cliente cuando paga</w:t>
+      </w:r>
+      <w:r>
+        <w:rPr>
+          <w:rFonts w:ascii="Arial" w:hAnsi="Arial" w:cs="Arial"/>
+          <w:lang w:val="es-MX"/>
+        </w:rPr>
+        <w:t>; se actualiza automáticamente el estado del cliente cuando se registra un pago.</w:t>
+      </w:r>
+    </w:p>
+    <w:p>
+      <w:pPr>
+        <w:jc w:val="both"/>
+        <w:rPr>
+          <w:rFonts w:ascii="Arial" w:hAnsi="Arial" w:cs="Arial"/>
+          <w:b/>
+          <w:bCs/>
+          <w:lang w:val="es-MX"/>
+        </w:rPr>
+      </w:pPr>
+    </w:p>
+    <w:p>
+      <w:pPr>
+        <w:jc w:val="both"/>
+        <w:rPr>
+          <w:rFonts w:ascii="Arial" w:hAnsi="Arial" w:cs="Arial"/>
+          <w:b/>
+          <w:bCs/>
+          <w:lang w:val="es-MX"/>
+        </w:rPr>
+      </w:pPr>
+      <w:r>
+        <w:rPr>
+          <w:rFonts w:ascii="Arial" w:hAnsi="Arial" w:cs="Arial"/>
+          <w:b/>
+          <w:bCs/>
+          <w:lang w:val="es-MX"/>
+        </w:rPr>
+        <w:t>STORED PROCEDURES</w:t>
+      </w:r>
+    </w:p>
+    <w:p>
+      <w:pPr>
+        <w:pStyle w:val="Prrafodelista"/>
+        <w:numPr>
+          <w:ilvl w:val="0"/>
+          <w:numId w:val="5"/>
+        </w:numPr>
+        <w:jc w:val="both"/>
+        <w:rPr>
+          <w:rFonts w:ascii="Arial" w:hAnsi="Arial" w:cs="Arial"/>
+          <w:b/>
+          <w:bCs/>
+          <w:lang w:val="es-MX"/>
+        </w:rPr>
+      </w:pPr>
+      <w:r>
+        <w:rPr>
+          <w:rFonts w:ascii="Arial" w:hAnsi="Arial" w:cs="Arial"/>
+          <w:b/>
+          <w:bCs/>
+          <w:lang w:val="es-MX"/>
+        </w:rPr>
+        <w:t>Registrar una reserva de una clase</w:t>
+      </w:r>
+    </w:p>
+    <w:p>
+      <w:pPr>
+        <w:jc w:val="both"/>
+        <w:rPr>
+          <w:rFonts w:ascii="Arial" w:hAnsi="Arial" w:cs="Arial"/>
+          <w:lang w:val="es-MX"/>
+        </w:rPr>
+      </w:pPr>
+      <w:r>
+        <w:rPr>
+          <w:rFonts w:ascii="Arial" w:hAnsi="Arial" w:cs="Arial"/>
+          <w:lang w:val="es-MX"/>
+        </w:rPr>
+        <w:t xml:space="preserve">El objetivo de este </w:t>
+      </w:r>
+      <w:proofErr w:type="spellStart"/>
+      <w:r>
+        <w:rPr>
+          <w:rFonts w:ascii="Arial" w:hAnsi="Arial" w:cs="Arial"/>
+          <w:lang w:val="es-MX"/>
+        </w:rPr>
+        <w:t>stored</w:t>
+      </w:r>
+      <w:proofErr w:type="spellEnd"/>
+      <w:r>
+        <w:rPr>
+          <w:rFonts w:ascii="Arial" w:hAnsi="Arial" w:cs="Arial"/>
+          <w:lang w:val="es-MX"/>
+        </w:rPr>
+        <w:t xml:space="preserve"> </w:t>
+      </w:r>
+      <w:proofErr w:type="spellStart"/>
+      <w:r>
+        <w:rPr>
+          <w:rFonts w:ascii="Arial" w:hAnsi="Arial" w:cs="Arial"/>
+          <w:lang w:val="es-MX"/>
+        </w:rPr>
+        <w:t>procedure</w:t>
+      </w:r>
+      <w:proofErr w:type="spellEnd"/>
+      <w:r>
+        <w:rPr>
+          <w:rFonts w:ascii="Arial" w:hAnsi="Arial" w:cs="Arial"/>
+          <w:lang w:val="es-MX"/>
+        </w:rPr>
+        <w:t xml:space="preserve"> es registrar una reserva sólo si el cliente está activo y si la clase existe.</w:t>
+      </w:r>
+    </w:p>
+    <w:p>
+      <w:pPr>
+        <w:jc w:val="both"/>
+        <w:rPr>
+          <w:rFonts w:ascii="Arial" w:hAnsi="Arial" w:cs="Arial"/>
+          <w:lang w:val="es-MX"/>
+        </w:rPr>
+      </w:pPr>
+      <w:r>
+        <w:rPr>
+          <w:rFonts w:ascii="Arial" w:hAnsi="Arial" w:cs="Arial"/>
+          <w:lang w:val="es-MX"/>
+        </w:rPr>
+        <w:t xml:space="preserve">El control de cupo ya lo hace el </w:t>
+      </w:r>
+      <w:proofErr w:type="spellStart"/>
+      <w:r>
+        <w:rPr>
+          <w:rFonts w:ascii="Arial" w:hAnsi="Arial" w:cs="Arial"/>
+          <w:lang w:val="es-MX"/>
+        </w:rPr>
+        <w:t>trigger</w:t>
+      </w:r>
+      <w:proofErr w:type="spellEnd"/>
+      <w:r>
+        <w:rPr>
+          <w:rFonts w:ascii="Arial" w:hAnsi="Arial" w:cs="Arial"/>
+          <w:lang w:val="es-MX"/>
+        </w:rPr>
+        <w:t>, así que aquí no se repite. Se evita que clientes inactivos se inscriban a las clases, y asegura que la clase a la que se inscriba exista.</w:t>
+      </w:r>
+    </w:p>
+    <w:p>
+      <w:pPr>
+        <w:pStyle w:val="Prrafodelista"/>
+        <w:numPr>
+          <w:ilvl w:val="0"/>
+          <w:numId w:val="5"/>
+        </w:numPr>
+        <w:jc w:val="both"/>
+        <w:rPr>
+          <w:rFonts w:ascii="Arial" w:hAnsi="Arial" w:cs="Arial"/>
+          <w:b/>
+          <w:bCs/>
+          <w:lang w:val="es-MX"/>
+        </w:rPr>
+      </w:pPr>
+      <w:r>
+        <w:rPr>
+          <w:rFonts w:ascii="Arial" w:hAnsi="Arial" w:cs="Arial"/>
+          <w:b/>
+          <w:bCs/>
+          <w:lang w:val="es-MX"/>
+        </w:rPr>
+        <w:t>Registrar un pago de membresía</w:t>
+      </w:r>
+    </w:p>
+    <w:p>
+      <w:pPr>
+        <w:jc w:val="both"/>
+        <w:rPr>
+          <w:rFonts w:ascii="Arial" w:hAnsi="Arial" w:cs="Arial"/>
+          <w:lang w:val="es-MX"/>
+        </w:rPr>
+      </w:pPr>
+      <w:r>
+        <w:rPr>
+          <w:rFonts w:ascii="Arial" w:hAnsi="Arial" w:cs="Arial"/>
+          <w:lang w:val="es-MX"/>
+        </w:rPr>
+        <w:t xml:space="preserve">El objetivo es registrar un pago y activar automáticamente al cliente reforzando así el </w:t>
+      </w:r>
+      <w:proofErr w:type="spellStart"/>
+      <w:r>
+        <w:rPr>
+          <w:rFonts w:ascii="Arial" w:hAnsi="Arial" w:cs="Arial"/>
+          <w:lang w:val="es-MX"/>
+        </w:rPr>
+        <w:t>trigger</w:t>
+      </w:r>
+      <w:proofErr w:type="spellEnd"/>
+      <w:r>
+        <w:rPr>
+          <w:rFonts w:ascii="Arial" w:hAnsi="Arial" w:cs="Arial"/>
+          <w:lang w:val="es-MX"/>
+        </w:rPr>
+        <w:t>.</w:t>
+      </w:r>
+    </w:p>
+    <w:p>
+      <w:pPr>
+        <w:jc w:val="both"/>
+        <w:rPr>
+          <w:rFonts w:ascii="Arial" w:hAnsi="Arial" w:cs="Arial"/>
+          <w:lang w:val="es-AR"/>
+        </w:rPr>
+      </w:pPr>
+      <w:r>
+        <w:rPr>
+          <w:rFonts w:ascii="Arial" w:hAnsi="Arial" w:cs="Arial"/>
+          <w:lang w:val="es-AR"/>
+        </w:rPr>
+        <w:t xml:space="preserve">El </w:t>
+      </w:r>
+      <w:proofErr w:type="spellStart"/>
+      <w:r>
+        <w:rPr>
+          <w:rFonts w:ascii="Arial" w:hAnsi="Arial" w:cs="Arial"/>
+          <w:lang w:val="es-AR"/>
+        </w:rPr>
+        <w:t>trigger</w:t>
+      </w:r>
+      <w:proofErr w:type="spellEnd"/>
+      <w:r>
+        <w:rPr>
+          <w:rFonts w:ascii="Arial" w:hAnsi="Arial" w:cs="Arial"/>
+          <w:lang w:val="es-AR"/>
+        </w:rPr>
+        <w:t xml:space="preserve"> AFTER ISERT ON pagos era el que se encargaba de activar al cliente. Aquí se registra el pago, inserta el pago y así dispara el </w:t>
+      </w:r>
+      <w:proofErr w:type="spellStart"/>
+      <w:r>
+        <w:rPr>
+          <w:rFonts w:ascii="Arial" w:hAnsi="Arial" w:cs="Arial"/>
+          <w:lang w:val="es-AR"/>
+        </w:rPr>
+        <w:t>trigger</w:t>
+      </w:r>
+      <w:proofErr w:type="spellEnd"/>
+      <w:r>
+        <w:rPr>
+          <w:rFonts w:ascii="Arial" w:hAnsi="Arial" w:cs="Arial"/>
+          <w:lang w:val="es-AR"/>
+        </w:rPr>
+        <w:t xml:space="preserve"> que activa automáticamente al cliente una vez que ya se realizó el pago.</w:t>
+      </w:r>
+    </w:p>
+    <w:p>
+      <w:pPr>
+        <w:rPr>
+          <w:rFonts w:ascii="Arial" w:hAnsi="Arial" w:cs="Arial"/>
+          <w:lang w:val="es-AR"/>
+        </w:rPr>
+      </w:pPr>
+    </w:p>
+    <w:p>
+      <w:pPr>
+        <w:rPr>
+          <w:b/>
+          <w:bCs/>
+        </w:rPr>
+      </w:pPr>
+      <w:r>
+        <w:rPr>
+          <w:b/>
+          <w:bCs/>
+        </w:rPr>
+        <w:t>Enlace al script SQL:</w:t>
+      </w:r>
+    </w:p>
+    <w:p>
+      <w:pPr>
+        <w:rPr>
+          <w:rFonts w:ascii="Arial" w:hAnsi="Arial" w:cs="Arial"/>
+        </w:rPr>
+      </w:pPr>
+      <w:hyperlink r:id="rId9" w:history="1">
+        <w:proofErr w:type="spellStart"/>
+        <w:r>
+          <w:rPr>
+            <w:rStyle w:val="Hipervnculo"/>
+          </w:rPr>
+          <w:t>CH_MySQL</w:t>
+        </w:r>
+        <w:proofErr w:type="spellEnd"/>
+        <w:r>
+          <w:rPr>
+            <w:rStyle w:val="Hipervnculo"/>
+          </w:rPr>
+          <w:t>/entregable_n2 at main · EmiTorres7/</w:t>
+        </w:r>
+        <w:proofErr w:type="spellStart"/>
+        <w:r>
+          <w:rPr>
+            <w:rStyle w:val="Hipervnculo"/>
+          </w:rPr>
+          <w:t>CH_MySQL</w:t>
+        </w:r>
+        <w:proofErr w:type="spellEnd"/>
+      </w:hyperlink>
+    </w:p>
+    <w:p>
+      <w:pPr>
+        <w:rPr>
+          <w:rFonts w:ascii="Arial" w:hAnsi="Arial" w:cs="Arial"/>
+        </w:rPr>
+      </w:pPr>
+    </w:p>
+    <w:p>
+      <w:pPr>
+        <w:rPr>
+          <w:rFonts w:ascii="Arial" w:hAnsi="Arial" w:cs="Arial"/>
         </w:rPr>
       </w:pPr>
     </w:p>
@@ -5211,6 +6544,273 @@
 <file path=word/numbering.xml><?xml version="1.0" encoding="utf-8"?>
 <w:numbering xmlns:wpc="http://schemas.microsoft.com/office/word/2010/wordprocessingCanvas" xmlns:cx="http://schemas.microsoft.com/office/drawing/2014/chartex" xmlns:cx1="http://schemas.microsoft.com/office/drawing/2015/9/8/chartex" xmlns:cx2="http://schemas.microsoft.com/office/drawing/2015/10/21/chartex" xmlns:cx3="http://schemas.microsoft.com/office/drawing/2016/5/9/chartex" xmlns:cx4="http://schemas.microsoft.com/office/drawing/2016/5/10/chartex" xmlns:cx5="http://schemas.microsoft.com/office/drawing/2016/5/11/chartex" xmlns:cx6="http://schemas.microsoft.com/office/drawing/2016/5/12/chartex" xmlns:cx7="http://schemas.microsoft.com/office/drawing/2016/5/13/chartex" xmlns:cx8="http://schemas.microsoft.com/office/drawing/2016/5/14/chartex" xmlns:mc="http://schemas.openxmlformats.org/markup-compatibility/2006" xmlns:aink="http://schemas.microsoft.com/office/drawing/2016/ink" xmlns:am3d="http://schemas.microsoft.com/office/drawing/2017/model3d" xmlns:o="urn:schemas-microsoft-com:office:office" xmlns:oel="http://schemas.microsoft.com/office/2019/extlst" xmlns:r="http://schemas.openxmlformats.org/officeDocument/2006/relationships" xmlns:m="http://schemas.openxmlformats.org/officeDocument/2006/math" xmlns:v="urn:schemas-microsoft-com:vml" xmlns:wp14="http://schemas.microsoft.com/office/word/2010/wordprocessingDrawing" xmlns:wp="http://schemas.openxmlformats.org/drawingml/2006/wordprocessingDrawing" xmlns:w10="urn:schemas-microsoft-com:office:word" xmlns:w="http://schemas.openxmlformats.org/wordprocessingml/2006/main" xmlns:w14="http://schemas.microsoft.com/office/word/2010/wordml" xmlns:w15="http://schemas.microsoft.com/office/word/2012/wordml" xmlns:w16cex="http://schemas.microsoft.com/office/word/2018/wordml/cex" xmlns:w16cid="http://schemas.microsoft.com/office/word/2016/wordml/cid" xmlns:w16="http://schemas.microsoft.com/office/word/2018/wordml" xmlns:w16sdtdh="http://schemas.microsoft.com/office/word/2020/wordml/sdtdatahash" xmlns:w16se="http://schemas.microsoft.com/office/word/2015/wordml/symex" xmlns:wpg="http://schemas.microsoft.com/office/word/2010/wordprocessingGroup" xmlns:wpi="http://schemas.microsoft.com/office/word/2010/wordprocessingInk" xmlns:wne="http://schemas.microsoft.com/office/word/2006/wordml" xmlns:wps="http://schemas.microsoft.com/office/word/2010/wordprocessingShape" mc:Ignorable="w14 w15 w16se w16cid w16 w16cex w16sdtdh wp14">
   <w:abstractNum w:abstractNumId="0" w15:restartNumberingAfterBreak="0">
+    <w:nsid w:val="0AF74C05"/>
+    <w:multiLevelType w:val="hybridMultilevel"/>
+    <w:tmpl w:val="41EC731C"/>
+    <w:lvl w:ilvl="0" w:tplc="2C0A000F">
+      <w:start w:val="1"/>
+      <w:numFmt w:val="decimal"/>
+      <w:lvlText w:val="%1."/>
+      <w:lvlJc w:val="left"/>
+      <w:pPr>
+        <w:ind w:left="720" w:hanging="360"/>
+      </w:pPr>
+      <w:rPr>
+        <w:rFonts w:hint="default"/>
+      </w:rPr>
+    </w:lvl>
+    <w:lvl w:ilvl="1" w:tplc="2C0A0019" w:tentative="1">
+      <w:start w:val="1"/>
+      <w:numFmt w:val="lowerLetter"/>
+      <w:lvlText w:val="%2."/>
+      <w:lvlJc w:val="left"/>
+      <w:pPr>
+        <w:ind w:left="1440" w:hanging="360"/>
+      </w:pPr>
+    </w:lvl>
+    <w:lvl w:ilvl="2" w:tplc="2C0A001B" w:tentative="1">
+      <w:start w:val="1"/>
+      <w:numFmt w:val="lowerRoman"/>
+      <w:lvlText w:val="%3."/>
+      <w:lvlJc w:val="right"/>
+      <w:pPr>
+        <w:ind w:left="2160" w:hanging="180"/>
+      </w:pPr>
+    </w:lvl>
+    <w:lvl w:ilvl="3" w:tplc="2C0A000F" w:tentative="1">
+      <w:start w:val="1"/>
+      <w:numFmt w:val="decimal"/>
+      <w:lvlText w:val="%4."/>
+      <w:lvlJc w:val="left"/>
+      <w:pPr>
+        <w:ind w:left="2880" w:hanging="360"/>
+      </w:pPr>
+    </w:lvl>
+    <w:lvl w:ilvl="4" w:tplc="2C0A0019" w:tentative="1">
+      <w:start w:val="1"/>
+      <w:numFmt w:val="lowerLetter"/>
+      <w:lvlText w:val="%5."/>
+      <w:lvlJc w:val="left"/>
+      <w:pPr>
+        <w:ind w:left="3600" w:hanging="360"/>
+      </w:pPr>
+    </w:lvl>
+    <w:lvl w:ilvl="5" w:tplc="2C0A001B" w:tentative="1">
+      <w:start w:val="1"/>
+      <w:numFmt w:val="lowerRoman"/>
+      <w:lvlText w:val="%6."/>
+      <w:lvlJc w:val="right"/>
+      <w:pPr>
+        <w:ind w:left="4320" w:hanging="180"/>
+      </w:pPr>
+    </w:lvl>
+    <w:lvl w:ilvl="6" w:tplc="2C0A000F" w:tentative="1">
+      <w:start w:val="1"/>
+      <w:numFmt w:val="decimal"/>
+      <w:lvlText w:val="%7."/>
+      <w:lvlJc w:val="left"/>
+      <w:pPr>
+        <w:ind w:left="5040" w:hanging="360"/>
+      </w:pPr>
+    </w:lvl>
+    <w:lvl w:ilvl="7" w:tplc="2C0A0019" w:tentative="1">
+      <w:start w:val="1"/>
+      <w:numFmt w:val="lowerLetter"/>
+      <w:lvlText w:val="%8."/>
+      <w:lvlJc w:val="left"/>
+      <w:pPr>
+        <w:ind w:left="5760" w:hanging="360"/>
+      </w:pPr>
+    </w:lvl>
+    <w:lvl w:ilvl="8" w:tplc="2C0A001B" w:tentative="1">
+      <w:start w:val="1"/>
+      <w:numFmt w:val="lowerRoman"/>
+      <w:lvlText w:val="%9."/>
+      <w:lvlJc w:val="right"/>
+      <w:pPr>
+        <w:ind w:left="6480" w:hanging="180"/>
+      </w:pPr>
+    </w:lvl>
+  </w:abstractNum>
+  <w:abstractNum w:abstractNumId="1" w15:restartNumberingAfterBreak="0">
+    <w:nsid w:val="1AD47DCE"/>
+    <w:multiLevelType w:val="hybridMultilevel"/>
+    <w:tmpl w:val="BA0CEC78"/>
+    <w:lvl w:ilvl="0" w:tplc="2C0A000F">
+      <w:start w:val="1"/>
+      <w:numFmt w:val="decimal"/>
+      <w:lvlText w:val="%1."/>
+      <w:lvlJc w:val="left"/>
+      <w:pPr>
+        <w:ind w:left="720" w:hanging="360"/>
+      </w:pPr>
+      <w:rPr>
+        <w:rFonts w:hint="default"/>
+      </w:rPr>
+    </w:lvl>
+    <w:lvl w:ilvl="1" w:tplc="2C0A0019" w:tentative="1">
+      <w:start w:val="1"/>
+      <w:numFmt w:val="lowerLetter"/>
+      <w:lvlText w:val="%2."/>
+      <w:lvlJc w:val="left"/>
+      <w:pPr>
+        <w:ind w:left="1440" w:hanging="360"/>
+      </w:pPr>
+    </w:lvl>
+    <w:lvl w:ilvl="2" w:tplc="2C0A001B" w:tentative="1">
+      <w:start w:val="1"/>
+      <w:numFmt w:val="lowerRoman"/>
+      <w:lvlText w:val="%3."/>
+      <w:lvlJc w:val="right"/>
+      <w:pPr>
+        <w:ind w:left="2160" w:hanging="180"/>
+      </w:pPr>
+    </w:lvl>
+    <w:lvl w:ilvl="3" w:tplc="2C0A000F" w:tentative="1">
+      <w:start w:val="1"/>
+      <w:numFmt w:val="decimal"/>
+      <w:lvlText w:val="%4."/>
+      <w:lvlJc w:val="left"/>
+      <w:pPr>
+        <w:ind w:left="2880" w:hanging="360"/>
+      </w:pPr>
+    </w:lvl>
+    <w:lvl w:ilvl="4" w:tplc="2C0A0019" w:tentative="1">
+      <w:start w:val="1"/>
+      <w:numFmt w:val="lowerLetter"/>
+      <w:lvlText w:val="%5."/>
+      <w:lvlJc w:val="left"/>
+      <w:pPr>
+        <w:ind w:left="3600" w:hanging="360"/>
+      </w:pPr>
+    </w:lvl>
+    <w:lvl w:ilvl="5" w:tplc="2C0A001B" w:tentative="1">
+      <w:start w:val="1"/>
+      <w:numFmt w:val="lowerRoman"/>
+      <w:lvlText w:val="%6."/>
+      <w:lvlJc w:val="right"/>
+      <w:pPr>
+        <w:ind w:left="4320" w:hanging="180"/>
+      </w:pPr>
+    </w:lvl>
+    <w:lvl w:ilvl="6" w:tplc="2C0A000F" w:tentative="1">
+      <w:start w:val="1"/>
+      <w:numFmt w:val="decimal"/>
+      <w:lvlText w:val="%7."/>
+      <w:lvlJc w:val="left"/>
+      <w:pPr>
+        <w:ind w:left="5040" w:hanging="360"/>
+      </w:pPr>
+    </w:lvl>
+    <w:lvl w:ilvl="7" w:tplc="2C0A0019" w:tentative="1">
+      <w:start w:val="1"/>
+      <w:numFmt w:val="lowerLetter"/>
+      <w:lvlText w:val="%8."/>
+      <w:lvlJc w:val="left"/>
+      <w:pPr>
+        <w:ind w:left="5760" w:hanging="360"/>
+      </w:pPr>
+    </w:lvl>
+    <w:lvl w:ilvl="8" w:tplc="2C0A001B" w:tentative="1">
+      <w:start w:val="1"/>
+      <w:numFmt w:val="lowerRoman"/>
+      <w:lvlText w:val="%9."/>
+      <w:lvlJc w:val="right"/>
+      <w:pPr>
+        <w:ind w:left="6480" w:hanging="180"/>
+      </w:pPr>
+    </w:lvl>
+  </w:abstractNum>
+  <w:abstractNum w:abstractNumId="2" w15:restartNumberingAfterBreak="0">
+    <w:nsid w:val="54907151"/>
+    <w:multiLevelType w:val="hybridMultilevel"/>
+    <w:tmpl w:val="AEAEF218"/>
+    <w:lvl w:ilvl="0" w:tplc="2C0A000F">
+      <w:start w:val="1"/>
+      <w:numFmt w:val="decimal"/>
+      <w:lvlText w:val="%1."/>
+      <w:lvlJc w:val="left"/>
+      <w:pPr>
+        <w:ind w:left="720" w:hanging="360"/>
+      </w:pPr>
+      <w:rPr>
+        <w:rFonts w:hint="default"/>
+      </w:rPr>
+    </w:lvl>
+    <w:lvl w:ilvl="1" w:tplc="2C0A0019" w:tentative="1">
+      <w:start w:val="1"/>
+      <w:numFmt w:val="lowerLetter"/>
+      <w:lvlText w:val="%2."/>
+      <w:lvlJc w:val="left"/>
+      <w:pPr>
+        <w:ind w:left="1440" w:hanging="360"/>
+      </w:pPr>
+    </w:lvl>
+    <w:lvl w:ilvl="2" w:tplc="2C0A001B" w:tentative="1">
+      <w:start w:val="1"/>
+      <w:numFmt w:val="lowerRoman"/>
+      <w:lvlText w:val="%3."/>
+      <w:lvlJc w:val="right"/>
+      <w:pPr>
+        <w:ind w:left="2160" w:hanging="180"/>
+      </w:pPr>
+    </w:lvl>
+    <w:lvl w:ilvl="3" w:tplc="2C0A000F" w:tentative="1">
+      <w:start w:val="1"/>
+      <w:numFmt w:val="decimal"/>
+      <w:lvlText w:val="%4."/>
+      <w:lvlJc w:val="left"/>
+      <w:pPr>
+        <w:ind w:left="2880" w:hanging="360"/>
+      </w:pPr>
+    </w:lvl>
+    <w:lvl w:ilvl="4" w:tplc="2C0A0019" w:tentative="1">
+      <w:start w:val="1"/>
+      <w:numFmt w:val="lowerLetter"/>
+      <w:lvlText w:val="%5."/>
+      <w:lvlJc w:val="left"/>
+      <w:pPr>
+        <w:ind w:left="3600" w:hanging="360"/>
+      </w:pPr>
+    </w:lvl>
+    <w:lvl w:ilvl="5" w:tplc="2C0A001B" w:tentative="1">
+      <w:start w:val="1"/>
+      <w:numFmt w:val="lowerRoman"/>
+      <w:lvlText w:val="%6."/>
+      <w:lvlJc w:val="right"/>
+      <w:pPr>
+        <w:ind w:left="4320" w:hanging="180"/>
+      </w:pPr>
+    </w:lvl>
+    <w:lvl w:ilvl="6" w:tplc="2C0A000F" w:tentative="1">
+      <w:start w:val="1"/>
+      <w:numFmt w:val="decimal"/>
+      <w:lvlText w:val="%7."/>
+      <w:lvlJc w:val="left"/>
+      <w:pPr>
+        <w:ind w:left="5040" w:hanging="360"/>
+      </w:pPr>
+    </w:lvl>
+    <w:lvl w:ilvl="7" w:tplc="2C0A0019" w:tentative="1">
+      <w:start w:val="1"/>
+      <w:numFmt w:val="lowerLetter"/>
+      <w:lvlText w:val="%8."/>
+      <w:lvlJc w:val="left"/>
+      <w:pPr>
+        <w:ind w:left="5760" w:hanging="360"/>
+      </w:pPr>
+    </w:lvl>
+    <w:lvl w:ilvl="8" w:tplc="2C0A001B" w:tentative="1">
+      <w:start w:val="1"/>
+      <w:numFmt w:val="lowerRoman"/>
+      <w:lvlText w:val="%9."/>
+      <w:lvlJc w:val="right"/>
+      <w:pPr>
+        <w:ind w:left="6480" w:hanging="180"/>
+      </w:pPr>
+    </w:lvl>
+  </w:abstractNum>
+  <w:abstractNum w:abstractNumId="3" w15:restartNumberingAfterBreak="0">
     <w:nsid w:val="64B36BAC"/>
     <w:multiLevelType w:val="hybridMultilevel"/>
     <w:tmpl w:val="5CACBC88"/>
@@ -5323,7 +6923,7 @@
       </w:rPr>
     </w:lvl>
   </w:abstractNum>
-  <w:abstractNum w:abstractNumId="1" w15:restartNumberingAfterBreak="0">
+  <w:abstractNum w:abstractNumId="4" w15:restartNumberingAfterBreak="0">
     <w:nsid w:val="77EB3CF0"/>
     <w:multiLevelType w:val="hybridMultilevel"/>
     <w:tmpl w:val="8BB62914"/>
@@ -5413,9 +7013,18 @@
     </w:lvl>
   </w:abstractNum>
   <w:num w:numId="1" w16cid:durableId="928780673">
+    <w:abstractNumId w:val="4"/>
+  </w:num>
+  <w:num w:numId="2" w16cid:durableId="1295335615">
+    <w:abstractNumId w:val="3"/>
+  </w:num>
+  <w:num w:numId="3" w16cid:durableId="1196385328">
+    <w:abstractNumId w:val="2"/>
+  </w:num>
+  <w:num w:numId="4" w16cid:durableId="1351296344">
     <w:abstractNumId w:val="1"/>
   </w:num>
-  <w:num w:numId="2" w16cid:durableId="1295335615">
+  <w:num w:numId="5" w16cid:durableId="1335650661">
     <w:abstractNumId w:val="0"/>
   </w:num>
 </w:numbering>
@@ -6031,7 +7640,6 @@
   <w:style w:type="character" w:default="1" w:styleId="Fuentedeprrafopredeter">
     <w:name w:val="Default Paragraph Font"/>
     <w:uiPriority w:val="1"/>
-    <w:semiHidden/>
     <w:unhideWhenUsed/>
   </w:style>
   <w:style w:type="table" w:default="1" w:styleId="Tablanormal">
@@ -6464,6 +8072,29 @@
     <w:uiPriority w:val="1"/>
     <w:rsid w:val="005762A6"/>
   </w:style>
+  <w:style w:type="character" w:styleId="Hipervnculo">
+    <w:name w:val="Hyperlink"/>
+    <w:basedOn w:val="Fuentedeprrafopredeter"/>
+    <w:uiPriority w:val="99"/>
+    <w:unhideWhenUsed/>
+    <w:rsid w:val="001F09CA"/>
+    <w:rPr>
+      <w:color w:val="467886" w:themeColor="hyperlink"/>
+      <w:u w:val="single"/>
+    </w:rPr>
+  </w:style>
+  <w:style w:type="character" w:styleId="Mencinsinresolver">
+    <w:name w:val="Unresolved Mention"/>
+    <w:basedOn w:val="Fuentedeprrafopredeter"/>
+    <w:uiPriority w:val="99"/>
+    <w:semiHidden/>
+    <w:unhideWhenUsed/>
+    <w:rsid w:val="003C29E0"/>
+    <w:rPr>
+      <w:color w:val="605E5C"/>
+      <w:shd w:val="clear" w:color="auto" w:fill="E1DFDD"/>
+    </w:rPr>
+  </w:style>
 </w:styles>
 </file>
 

</xml_diff>